<commit_message>
Plug-in token context: full path and size of the file
A library can now read the file itself (for example to tell thermal from color
pictures). Developer manual updated (context keys, reading files fast).

Co-Authored-By: Claude Opus 5.5 <noreply@anthropic.com>
</commit_message>
<xml_diff>
--- a/docs/Plugin_Developer_Manual.docx
+++ b/docs/Plugin_Developer_Manual.docx
@@ -2992,7 +2992,8 @@
     <w:tbl>
       <w:tblPr>
         <w:tblStyle w:val="Table"/>
-        <w:tblW w:type="auto" w:w="0"/>
+        <w:tblW w:type="pct" w:w="5000"/>
+        <w:tblLayout w:type="fixed"/>
         <w:tblLook w:firstRow="1" w:lastRow="0" w:firstColumn="0" w:lastColumn="0" w:noHBand="0" w:noVBand="0" w:val="0020"/>
       </w:tblPr>
       <w:tblGrid>
@@ -3203,6 +3204,75 @@
           </w:p>
         </w:tc>
       </w:tr>
+      <w:tr>
+        <w:tc>
+          <w:tcPr/>
+          <w:p>
+            <w:pPr>
+              <w:pStyle w:val="Compact"/>
+            </w:pPr>
+            <w:r>
+              <w:rPr>
+                <w:rStyle w:val="VerbatimChar"/>
+              </w:rPr>
+              <w:t xml:space="preserve">Path</w:t>
+            </w:r>
+          </w:p>
+        </w:tc>
+        <w:tc>
+          <w:tcPr/>
+          <w:p>
+            <w:pPr>
+              <w:pStyle w:val="Compact"/>
+            </w:pPr>
+            <w:r>
+              <w:t xml:space="preserve">full path of the file on the source (empty for the Example line), so a library can read the file itself, for example to tell thermal from color pictures</w:t>
+            </w:r>
+          </w:p>
+        </w:tc>
+      </w:tr>
+      <w:tr>
+        <w:tc>
+          <w:tcPr/>
+          <w:p>
+            <w:pPr>
+              <w:pStyle w:val="Compact"/>
+            </w:pPr>
+            <w:r>
+              <w:rPr>
+                <w:rStyle w:val="VerbatimChar"/>
+              </w:rPr>
+              <w:t xml:space="preserve">Size</w:t>
+            </w:r>
+          </w:p>
+        </w:tc>
+        <w:tc>
+          <w:tcPr/>
+          <w:p>
+            <w:pPr>
+              <w:pStyle w:val="Compact"/>
+            </w:pPr>
+            <w:r>
+              <w:t xml:space="preserve">file size in bytes (with</w:t>
+            </w:r>
+            <w:r>
+              <w:t xml:space="preserve"> </w:t>
+            </w:r>
+            <w:r>
+              <w:rPr>
+                <w:rStyle w:val="VerbatimChar"/>
+              </w:rPr>
+              <w:t xml:space="preserve">Path</w:t>
+            </w:r>
+            <w:r>
+              <w:t xml:space="preserve"> </w:t>
+            </w:r>
+            <w:r>
+              <w:t xml:space="preserve">a good key for remembering what was read)</w:t>
+            </w:r>
+          </w:p>
+        </w:tc>
+      </w:tr>
     </w:tbl>
     <w:p>
       <w:pPr>
@@ -3224,7 +3294,16 @@
         <w:t xml:space="preserve"> </w:t>
       </w:r>
       <w:r>
-        <w:t xml:space="preserve">fast and free of file or network access.</w:t>
+        <w:t xml:space="preserve">fast. If it reads the file (</w:t>
+      </w:r>
+      <w:r>
+        <w:rPr>
+          <w:rStyle w:val="VerbatimChar"/>
+        </w:rPr>
+        <w:t xml:space="preserve">Path</w:t>
+      </w:r>
+      <w:r>
+        <w:t xml:space="preserve">), read only the start or the header, and remember the answer by path and size, so each file is read once. No network access.</w:t>
       </w:r>
     </w:p>
     <w:p>

</xml_diff>

<commit_message>
Plug-in window: fields marked Invalid are shown red; Download Path token list no longer cut off on Linux
- pd_check may return Invalid.<key>=1; that box is shown light red with dark
  red text (OK stays disabled while there is an error, as before).
- Download Path tab: the token columns are taller (the last line was cut off
  on Linux GTK 2), Show tokens and the controls below moved down; the
  Preferences window is 30 pixels taller.
- Build 202.

Co-Authored-By: Claude Opus 5.5 <noreply@anthropic.com>
</commit_message>
<xml_diff>
--- a/docs/Plugin_Developer_Manual.docx
+++ b/docs/Plugin_Developer_Manual.docx
@@ -3554,6 +3554,42 @@
             </w:r>
             <w:r>
               <w:t xml:space="preserve">)</w:t>
+            </w:r>
+          </w:p>
+        </w:tc>
+      </w:tr>
+      <w:tr>
+        <w:tc>
+          <w:tcPr/>
+          <w:p>
+            <w:pPr>
+              <w:pStyle w:val="Compact"/>
+            </w:pPr>
+            <w:r>
+              <w:rPr>
+                <w:rStyle w:val="VerbatimChar"/>
+              </w:rPr>
+              <w:t xml:space="preserve">Invalid.&lt;key&gt;</w:t>
+            </w:r>
+          </w:p>
+        </w:tc>
+        <w:tc>
+          <w:tcPr/>
+          <w:p>
+            <w:pPr>
+              <w:pStyle w:val="Compact"/>
+            </w:pPr>
+            <w:r>
+              <w:rPr>
+                <w:rStyle w:val="VerbatimChar"/>
+              </w:rPr>
+              <w:t xml:space="preserve">1</w:t>
+            </w:r>
+            <w:r>
+              <w:t xml:space="preserve"> </w:t>
+            </w:r>
+            <w:r>
+              <w:t xml:space="preserve">= that field breaks its rule: its box is shown light red with dark red text until it is right</w:t>
             </w:r>
           </w:p>
         </w:tc>

</xml_diff>